<commit_message>
juillet + comparaison des classement mois n et n-1
</commit_message>
<xml_diff>
--- a/assets/modele_word_rapport_OFB.docx
+++ b/assets/modele_word_rapport_OFB.docx
@@ -1,6 +1,6 @@
 
 <file path=word/document.xml><?xml version="1.0" encoding="utf-8"?>
-<w:document xmlns:wpc="http://schemas.microsoft.com/office/word/2010/wordprocessingCanvas" xmlns:cx="http://schemas.microsoft.com/office/drawing/2014/chartex" xmlns:cx1="http://schemas.microsoft.com/office/drawing/2015/9/8/chartex" xmlns:cx2="http://schemas.microsoft.com/office/drawing/2015/10/21/chartex" xmlns:cx3="http://schemas.microsoft.com/office/drawing/2016/5/9/chartex" xmlns:cx4="http://schemas.microsoft.com/office/drawing/2016/5/10/chartex" xmlns:cx5="http://schemas.microsoft.com/office/drawing/2016/5/11/chartex" xmlns:cx6="http://schemas.microsoft.com/office/drawing/2016/5/12/chartex" xmlns:cx7="http://schemas.microsoft.com/office/drawing/2016/5/13/chartex" xmlns:cx8="http://schemas.microsoft.com/office/drawing/2016/5/14/chartex" xmlns:mc="http://schemas.openxmlformats.org/markup-compatibility/2006" xmlns:aink="http://schemas.microsoft.com/office/drawing/2016/ink" xmlns:am3d="http://schemas.microsoft.com/office/drawing/2017/model3d" xmlns:o="urn:schemas-microsoft-com:office:office" xmlns:r="http://schemas.openxmlformats.org/officeDocument/2006/relationships" xmlns:m="http://schemas.openxmlformats.org/officeDocument/2006/math" xmlns:v="urn:schemas-microsoft-com:vml" xmlns:wp14="http://schemas.microsoft.com/office/word/2010/wordprocessingDrawing" xmlns:wp="http://schemas.openxmlformats.org/drawingml/2006/wordprocessingDrawing" xmlns:w10="urn:schemas-microsoft-com:office:word" xmlns:w="http://schemas.openxmlformats.org/wordprocessingml/2006/main" xmlns:w14="http://schemas.microsoft.com/office/word/2010/wordml" xmlns:w15="http://schemas.microsoft.com/office/word/2012/wordml" xmlns:w16cid="http://schemas.microsoft.com/office/word/2016/wordml/cid" xmlns:w16se="http://schemas.microsoft.com/office/word/2015/wordml/symex" xmlns:wpg="http://schemas.microsoft.com/office/word/2010/wordprocessingGroup" xmlns:wpi="http://schemas.microsoft.com/office/word/2010/wordprocessingInk" xmlns:wne="http://schemas.microsoft.com/office/word/2006/wordml" xmlns:wps="http://schemas.microsoft.com/office/word/2010/wordprocessingShape" mc:Ignorable="w14 w15 w16se w16cid wp14">
+<w:document xmlns:wpc="http://schemas.microsoft.com/office/word/2010/wordprocessingCanvas" xmlns:cx="http://schemas.microsoft.com/office/drawing/2014/chartex" xmlns:cx1="http://schemas.microsoft.com/office/drawing/2015/9/8/chartex" xmlns:cx2="http://schemas.microsoft.com/office/drawing/2015/10/21/chartex" xmlns:cx3="http://schemas.microsoft.com/office/drawing/2016/5/9/chartex" xmlns:cx4="http://schemas.microsoft.com/office/drawing/2016/5/10/chartex" xmlns:cx5="http://schemas.microsoft.com/office/drawing/2016/5/11/chartex" xmlns:cx6="http://schemas.microsoft.com/office/drawing/2016/5/12/chartex" xmlns:cx7="http://schemas.microsoft.com/office/drawing/2016/5/13/chartex" xmlns:cx8="http://schemas.microsoft.com/office/drawing/2016/5/14/chartex" xmlns:mc="http://schemas.openxmlformats.org/markup-compatibility/2006" xmlns:aink="http://schemas.microsoft.com/office/drawing/2016/ink" xmlns:am3d="http://schemas.microsoft.com/office/drawing/2017/model3d" xmlns:o="urn:schemas-microsoft-com:office:office" xmlns:oel="http://schemas.microsoft.com/office/2019/extlst" xmlns:r="http://schemas.openxmlformats.org/officeDocument/2006/relationships" xmlns:m="http://schemas.openxmlformats.org/officeDocument/2006/math" xmlns:v="urn:schemas-microsoft-com:vml" xmlns:wp14="http://schemas.microsoft.com/office/word/2010/wordprocessingDrawing" xmlns:wp="http://schemas.openxmlformats.org/drawingml/2006/wordprocessingDrawing" xmlns:w10="urn:schemas-microsoft-com:office:word" xmlns:w="http://schemas.openxmlformats.org/wordprocessingml/2006/main" xmlns:w14="http://schemas.microsoft.com/office/word/2010/wordml" xmlns:w15="http://schemas.microsoft.com/office/word/2012/wordml" xmlns:w16cex="http://schemas.microsoft.com/office/word/2018/wordml/cex" xmlns:w16cid="http://schemas.microsoft.com/office/word/2016/wordml/cid" xmlns:w16="http://schemas.microsoft.com/office/word/2018/wordml" xmlns:w16du="http://schemas.microsoft.com/office/word/2023/wordml/word16du" xmlns:w16sdtdh="http://schemas.microsoft.com/office/word/2020/wordml/sdtdatahash" xmlns:w16sdtfl="http://schemas.microsoft.com/office/word/2024/wordml/sdtformatlock" xmlns:w16se="http://schemas.microsoft.com/office/word/2015/wordml/symex" xmlns:wpg="http://schemas.microsoft.com/office/word/2010/wordprocessingGroup" xmlns:wpi="http://schemas.microsoft.com/office/word/2010/wordprocessingInk" xmlns:wne="http://schemas.microsoft.com/office/word/2006/wordml" xmlns:wps="http://schemas.microsoft.com/office/word/2010/wordprocessingShape" mc:Ignorable="w14 w15 w16se w16cid w16 w16cex w16sdtdh w16sdtfl w16du wp14">
   <w:body>
     <w:p>
       <w:pPr>
@@ -474,8 +474,8 @@
       <w:pPr>
         <w:pStyle w:val="FirstParagraph"/>
         <w:rPr>
-          <w:rStyle w:val="Assecstyle"/>
-          <w:sz w:val="24"/>
+          <w:i/>
+          <w:iCs/>
         </w:rPr>
       </w:pPr>
       <w:r>
@@ -546,6 +546,79 @@
     </w:p>
     <w:p>
       <w:pPr>
+        <w:pStyle w:val="Corpsdetexte"/>
+      </w:pPr>
+    </w:p>
+    <w:p>
+      <w:pPr>
+        <w:pStyle w:val="Lgende"/>
+        <w:keepNext/>
+      </w:pPr>
+      <w:r>
+        <w:t xml:space="preserve">Tableau </w:t>
+      </w:r>
+      <w:r>
+        <w:fldChar w:fldCharType="begin"/>
+      </w:r>
+      <w:r>
+        <w:instrText xml:space="preserve"> SEQ Tableau \* ARABIC </w:instrText>
+      </w:r>
+      <w:r>
+        <w:fldChar w:fldCharType="separate"/>
+      </w:r>
+      <w:r>
+        <w:rPr>
+          <w:noProof/>
+        </w:rPr>
+        <w:t>1</w:t>
+      </w:r>
+      <w:r>
+        <w:fldChar w:fldCharType="end"/>
+      </w:r>
+      <w:r>
+        <w:t xml:space="preserve"> : xxx</w:t>
+      </w:r>
+    </w:p>
+    <w:tbl>
+      <w:tblPr>
+        <w:tblStyle w:val="Grilledutableau"/>
+        <w:tblW w:w="0" w:type="auto"/>
+        <w:tblLook w:val="04A0" w:firstRow="1" w:lastRow="0" w:firstColumn="1" w:lastColumn="0" w:noHBand="0" w:noVBand="1"/>
+      </w:tblPr>
+      <w:tblGrid>
+        <w:gridCol w:w="5038"/>
+        <w:gridCol w:w="5038"/>
+      </w:tblGrid>
+      <w:tr>
+        <w:tc>
+          <w:tcPr>
+            <w:tcW w:w="5038" w:type="dxa"/>
+          </w:tcPr>
+          <w:p>
+            <w:pPr>
+              <w:pStyle w:val="Corpsdetexte"/>
+            </w:pPr>
+          </w:p>
+        </w:tc>
+        <w:tc>
+          <w:tcPr>
+            <w:tcW w:w="5038" w:type="dxa"/>
+          </w:tcPr>
+          <w:p>
+            <w:pPr>
+              <w:pStyle w:val="Corpsdetexte"/>
+            </w:pPr>
+          </w:p>
+        </w:tc>
+      </w:tr>
+    </w:tbl>
+    <w:p>
+      <w:pPr>
+        <w:pStyle w:val="Corpsdetexte"/>
+      </w:pPr>
+    </w:p>
+    <w:p>
+      <w:pPr>
         <w:pStyle w:val="Titre2"/>
       </w:pPr>
       <w:bookmarkStart w:id="4" w:name="_Toc170482748"/>
@@ -565,10 +638,9 @@
         <w:pStyle w:val="Titre1"/>
       </w:pPr>
       <w:r>
+        <w:lastRenderedPageBreak/>
         <w:t>Conclusion</w:t>
       </w:r>
-      <w:bookmarkStart w:id="6" w:name="_GoBack"/>
-      <w:bookmarkEnd w:id="6"/>
     </w:p>
     <w:p>
       <w:pPr>
@@ -597,7 +669,7 @@
 </file>
 
 <file path=word/endnotes.xml><?xml version="1.0" encoding="utf-8"?>
-<w:endnotes xmlns:wpc="http://schemas.microsoft.com/office/word/2010/wordprocessingCanvas" xmlns:cx="http://schemas.microsoft.com/office/drawing/2014/chartex" xmlns:cx1="http://schemas.microsoft.com/office/drawing/2015/9/8/chartex" xmlns:cx2="http://schemas.microsoft.com/office/drawing/2015/10/21/chartex" xmlns:cx3="http://schemas.microsoft.com/office/drawing/2016/5/9/chartex" xmlns:cx4="http://schemas.microsoft.com/office/drawing/2016/5/10/chartex" xmlns:cx5="http://schemas.microsoft.com/office/drawing/2016/5/11/chartex" xmlns:cx6="http://schemas.microsoft.com/office/drawing/2016/5/12/chartex" xmlns:cx7="http://schemas.microsoft.com/office/drawing/2016/5/13/chartex" xmlns:cx8="http://schemas.microsoft.com/office/drawing/2016/5/14/chartex" xmlns:mc="http://schemas.openxmlformats.org/markup-compatibility/2006" xmlns:aink="http://schemas.microsoft.com/office/drawing/2016/ink" xmlns:am3d="http://schemas.microsoft.com/office/drawing/2017/model3d" xmlns:o="urn:schemas-microsoft-com:office:office" xmlns:r="http://schemas.openxmlformats.org/officeDocument/2006/relationships" xmlns:m="http://schemas.openxmlformats.org/officeDocument/2006/math" xmlns:v="urn:schemas-microsoft-com:vml" xmlns:wp14="http://schemas.microsoft.com/office/word/2010/wordprocessingDrawing" xmlns:wp="http://schemas.openxmlformats.org/drawingml/2006/wordprocessingDrawing" xmlns:w10="urn:schemas-microsoft-com:office:word" xmlns:w="http://schemas.openxmlformats.org/wordprocessingml/2006/main" xmlns:w14="http://schemas.microsoft.com/office/word/2010/wordml" xmlns:w15="http://schemas.microsoft.com/office/word/2012/wordml" xmlns:w16cid="http://schemas.microsoft.com/office/word/2016/wordml/cid" xmlns:w16se="http://schemas.microsoft.com/office/word/2015/wordml/symex" xmlns:wpg="http://schemas.microsoft.com/office/word/2010/wordprocessingGroup" xmlns:wpi="http://schemas.microsoft.com/office/word/2010/wordprocessingInk" xmlns:wne="http://schemas.microsoft.com/office/word/2006/wordml" xmlns:wps="http://schemas.microsoft.com/office/word/2010/wordprocessingShape" mc:Ignorable="w14 w15 w16se w16cid wp14">
+<w:endnotes xmlns:wpc="http://schemas.microsoft.com/office/word/2010/wordprocessingCanvas" xmlns:cx="http://schemas.microsoft.com/office/drawing/2014/chartex" xmlns:cx1="http://schemas.microsoft.com/office/drawing/2015/9/8/chartex" xmlns:cx2="http://schemas.microsoft.com/office/drawing/2015/10/21/chartex" xmlns:cx3="http://schemas.microsoft.com/office/drawing/2016/5/9/chartex" xmlns:cx4="http://schemas.microsoft.com/office/drawing/2016/5/10/chartex" xmlns:cx5="http://schemas.microsoft.com/office/drawing/2016/5/11/chartex" xmlns:cx6="http://schemas.microsoft.com/office/drawing/2016/5/12/chartex" xmlns:cx7="http://schemas.microsoft.com/office/drawing/2016/5/13/chartex" xmlns:cx8="http://schemas.microsoft.com/office/drawing/2016/5/14/chartex" xmlns:mc="http://schemas.openxmlformats.org/markup-compatibility/2006" xmlns:aink="http://schemas.microsoft.com/office/drawing/2016/ink" xmlns:am3d="http://schemas.microsoft.com/office/drawing/2017/model3d" xmlns:o="urn:schemas-microsoft-com:office:office" xmlns:oel="http://schemas.microsoft.com/office/2019/extlst" xmlns:r="http://schemas.openxmlformats.org/officeDocument/2006/relationships" xmlns:m="http://schemas.openxmlformats.org/officeDocument/2006/math" xmlns:v="urn:schemas-microsoft-com:vml" xmlns:wp14="http://schemas.microsoft.com/office/word/2010/wordprocessingDrawing" xmlns:wp="http://schemas.openxmlformats.org/drawingml/2006/wordprocessingDrawing" xmlns:w10="urn:schemas-microsoft-com:office:word" xmlns:w="http://schemas.openxmlformats.org/wordprocessingml/2006/main" xmlns:w14="http://schemas.microsoft.com/office/word/2010/wordml" xmlns:w15="http://schemas.microsoft.com/office/word/2012/wordml" xmlns:w16cex="http://schemas.microsoft.com/office/word/2018/wordml/cex" xmlns:w16cid="http://schemas.microsoft.com/office/word/2016/wordml/cid" xmlns:w16="http://schemas.microsoft.com/office/word/2018/wordml" xmlns:w16du="http://schemas.microsoft.com/office/word/2023/wordml/word16du" xmlns:w16sdtdh="http://schemas.microsoft.com/office/word/2020/wordml/sdtdatahash" xmlns:w16sdtfl="http://schemas.microsoft.com/office/word/2024/wordml/sdtformatlock" xmlns:w16se="http://schemas.microsoft.com/office/word/2015/wordml/symex" xmlns:wpg="http://schemas.microsoft.com/office/word/2010/wordprocessingGroup" xmlns:wpi="http://schemas.microsoft.com/office/word/2010/wordprocessingInk" xmlns:wne="http://schemas.microsoft.com/office/word/2006/wordml" xmlns:wps="http://schemas.microsoft.com/office/word/2010/wordprocessingShape" mc:Ignorable="w14 w15 w16se w16cid w16 w16cex w16sdtdh w16sdtfl w16du wp14">
   <w:endnote w:type="separator" w:id="-1">
     <w:p>
       <w:pPr>
@@ -622,7 +694,7 @@
 </file>
 
 <file path=word/footer1.xml><?xml version="1.0" encoding="utf-8"?>
-<w:ftr xmlns:wpc="http://schemas.microsoft.com/office/word/2010/wordprocessingCanvas" xmlns:cx="http://schemas.microsoft.com/office/drawing/2014/chartex" xmlns:cx1="http://schemas.microsoft.com/office/drawing/2015/9/8/chartex" xmlns:cx2="http://schemas.microsoft.com/office/drawing/2015/10/21/chartex" xmlns:cx3="http://schemas.microsoft.com/office/drawing/2016/5/9/chartex" xmlns:cx4="http://schemas.microsoft.com/office/drawing/2016/5/10/chartex" xmlns:cx5="http://schemas.microsoft.com/office/drawing/2016/5/11/chartex" xmlns:cx6="http://schemas.microsoft.com/office/drawing/2016/5/12/chartex" xmlns:cx7="http://schemas.microsoft.com/office/drawing/2016/5/13/chartex" xmlns:cx8="http://schemas.microsoft.com/office/drawing/2016/5/14/chartex" xmlns:mc="http://schemas.openxmlformats.org/markup-compatibility/2006" xmlns:aink="http://schemas.microsoft.com/office/drawing/2016/ink" xmlns:am3d="http://schemas.microsoft.com/office/drawing/2017/model3d" xmlns:o="urn:schemas-microsoft-com:office:office" xmlns:r="http://schemas.openxmlformats.org/officeDocument/2006/relationships" xmlns:m="http://schemas.openxmlformats.org/officeDocument/2006/math" xmlns:v="urn:schemas-microsoft-com:vml" xmlns:wp14="http://schemas.microsoft.com/office/word/2010/wordprocessingDrawing" xmlns:wp="http://schemas.openxmlformats.org/drawingml/2006/wordprocessingDrawing" xmlns:w10="urn:schemas-microsoft-com:office:word" xmlns:w="http://schemas.openxmlformats.org/wordprocessingml/2006/main" xmlns:w14="http://schemas.microsoft.com/office/word/2010/wordml" xmlns:w15="http://schemas.microsoft.com/office/word/2012/wordml" xmlns:w16cid="http://schemas.microsoft.com/office/word/2016/wordml/cid" xmlns:w16se="http://schemas.microsoft.com/office/word/2015/wordml/symex" xmlns:wpg="http://schemas.microsoft.com/office/word/2010/wordprocessingGroup" xmlns:wpi="http://schemas.microsoft.com/office/word/2010/wordprocessingInk" xmlns:wne="http://schemas.microsoft.com/office/word/2006/wordml" xmlns:wps="http://schemas.microsoft.com/office/word/2010/wordprocessingShape" mc:Ignorable="w14 w15 w16se w16cid wp14">
+<w:ftr xmlns:wpc="http://schemas.microsoft.com/office/word/2010/wordprocessingCanvas" xmlns:cx="http://schemas.microsoft.com/office/drawing/2014/chartex" xmlns:cx1="http://schemas.microsoft.com/office/drawing/2015/9/8/chartex" xmlns:cx2="http://schemas.microsoft.com/office/drawing/2015/10/21/chartex" xmlns:cx3="http://schemas.microsoft.com/office/drawing/2016/5/9/chartex" xmlns:cx4="http://schemas.microsoft.com/office/drawing/2016/5/10/chartex" xmlns:cx5="http://schemas.microsoft.com/office/drawing/2016/5/11/chartex" xmlns:cx6="http://schemas.microsoft.com/office/drawing/2016/5/12/chartex" xmlns:cx7="http://schemas.microsoft.com/office/drawing/2016/5/13/chartex" xmlns:cx8="http://schemas.microsoft.com/office/drawing/2016/5/14/chartex" xmlns:mc="http://schemas.openxmlformats.org/markup-compatibility/2006" xmlns:aink="http://schemas.microsoft.com/office/drawing/2016/ink" xmlns:am3d="http://schemas.microsoft.com/office/drawing/2017/model3d" xmlns:o="urn:schemas-microsoft-com:office:office" xmlns:oel="http://schemas.microsoft.com/office/2019/extlst" xmlns:r="http://schemas.openxmlformats.org/officeDocument/2006/relationships" xmlns:m="http://schemas.openxmlformats.org/officeDocument/2006/math" xmlns:v="urn:schemas-microsoft-com:vml" xmlns:wp14="http://schemas.microsoft.com/office/word/2010/wordprocessingDrawing" xmlns:wp="http://schemas.openxmlformats.org/drawingml/2006/wordprocessingDrawing" xmlns:w10="urn:schemas-microsoft-com:office:word" xmlns:w="http://schemas.openxmlformats.org/wordprocessingml/2006/main" xmlns:w14="http://schemas.microsoft.com/office/word/2010/wordml" xmlns:w15="http://schemas.microsoft.com/office/word/2012/wordml" xmlns:w16cex="http://schemas.microsoft.com/office/word/2018/wordml/cex" xmlns:w16cid="http://schemas.microsoft.com/office/word/2016/wordml/cid" xmlns:w16="http://schemas.microsoft.com/office/word/2018/wordml" xmlns:w16du="http://schemas.microsoft.com/office/word/2023/wordml/word16du" xmlns:w16sdtdh="http://schemas.microsoft.com/office/word/2020/wordml/sdtdatahash" xmlns:w16sdtfl="http://schemas.microsoft.com/office/word/2024/wordml/sdtformatlock" xmlns:w16se="http://schemas.microsoft.com/office/word/2015/wordml/symex" xmlns:wpg="http://schemas.microsoft.com/office/word/2010/wordprocessingGroup" xmlns:wpi="http://schemas.microsoft.com/office/word/2010/wordprocessingInk" xmlns:wne="http://schemas.microsoft.com/office/word/2006/wordml" xmlns:wps="http://schemas.microsoft.com/office/word/2010/wordprocessingShape" mc:Ignorable="w14 w15 w16se w16cid w16 w16cex w16sdtdh w16sdtfl w16du wp14">
   <w:sdt>
     <w:sdtPr>
       <w:rPr>
@@ -635,7 +707,6 @@
         <w:docPartUnique/>
       </w:docPartObj>
     </w:sdtPr>
-    <w:sdtEndPr/>
     <w:sdtContent>
       <w:sdt>
         <w:sdtPr>
@@ -649,7 +720,6 @@
             <w:docPartUnique/>
           </w:docPartObj>
         </w:sdtPr>
-        <w:sdtEndPr/>
         <w:sdtContent>
           <w:p>
             <w:pPr>
@@ -667,7 +737,7 @@
                 <w:szCs w:val="18"/>
               </w:rPr>
               <w:drawing>
-                <wp:anchor distT="0" distB="0" distL="114300" distR="114300" simplePos="0" relativeHeight="251658240" behindDoc="1" locked="0" layoutInCell="0" allowOverlap="1" wp14:anchorId="025E2639" wp14:editId="70ED0570">
+                <wp:anchor distT="0" distB="0" distL="114300" distR="114300" simplePos="0" relativeHeight="251658240" behindDoc="1" locked="0" layoutInCell="0" allowOverlap="1" wp14:anchorId="6863653A" wp14:editId="482F4CFE">
                   <wp:simplePos x="0" y="0"/>
                   <wp:positionH relativeFrom="page">
                     <wp:posOffset>4281170</wp:posOffset>
@@ -850,7 +920,7 @@
 </file>
 
 <file path=word/footer2.xml><?xml version="1.0" encoding="utf-8"?>
-<w:ftr xmlns:wpc="http://schemas.microsoft.com/office/word/2010/wordprocessingCanvas" xmlns:cx="http://schemas.microsoft.com/office/drawing/2014/chartex" xmlns:cx1="http://schemas.microsoft.com/office/drawing/2015/9/8/chartex" xmlns:cx2="http://schemas.microsoft.com/office/drawing/2015/10/21/chartex" xmlns:cx3="http://schemas.microsoft.com/office/drawing/2016/5/9/chartex" xmlns:cx4="http://schemas.microsoft.com/office/drawing/2016/5/10/chartex" xmlns:cx5="http://schemas.microsoft.com/office/drawing/2016/5/11/chartex" xmlns:cx6="http://schemas.microsoft.com/office/drawing/2016/5/12/chartex" xmlns:cx7="http://schemas.microsoft.com/office/drawing/2016/5/13/chartex" xmlns:cx8="http://schemas.microsoft.com/office/drawing/2016/5/14/chartex" xmlns:mc="http://schemas.openxmlformats.org/markup-compatibility/2006" xmlns:aink="http://schemas.microsoft.com/office/drawing/2016/ink" xmlns:am3d="http://schemas.microsoft.com/office/drawing/2017/model3d" xmlns:o="urn:schemas-microsoft-com:office:office" xmlns:r="http://schemas.openxmlformats.org/officeDocument/2006/relationships" xmlns:m="http://schemas.openxmlformats.org/officeDocument/2006/math" xmlns:v="urn:schemas-microsoft-com:vml" xmlns:wp14="http://schemas.microsoft.com/office/word/2010/wordprocessingDrawing" xmlns:wp="http://schemas.openxmlformats.org/drawingml/2006/wordprocessingDrawing" xmlns:w10="urn:schemas-microsoft-com:office:word" xmlns:w="http://schemas.openxmlformats.org/wordprocessingml/2006/main" xmlns:w14="http://schemas.microsoft.com/office/word/2010/wordml" xmlns:w15="http://schemas.microsoft.com/office/word/2012/wordml" xmlns:w16cid="http://schemas.microsoft.com/office/word/2016/wordml/cid" xmlns:w16se="http://schemas.microsoft.com/office/word/2015/wordml/symex" xmlns:wpg="http://schemas.microsoft.com/office/word/2010/wordprocessingGroup" xmlns:wpi="http://schemas.microsoft.com/office/word/2010/wordprocessingInk" xmlns:wne="http://schemas.microsoft.com/office/word/2006/wordml" xmlns:wps="http://schemas.microsoft.com/office/word/2010/wordprocessingShape" mc:Ignorable="w14 w15 w16se w16cid wp14">
+<w:ftr xmlns:wpc="http://schemas.microsoft.com/office/word/2010/wordprocessingCanvas" xmlns:cx="http://schemas.microsoft.com/office/drawing/2014/chartex" xmlns:cx1="http://schemas.microsoft.com/office/drawing/2015/9/8/chartex" xmlns:cx2="http://schemas.microsoft.com/office/drawing/2015/10/21/chartex" xmlns:cx3="http://schemas.microsoft.com/office/drawing/2016/5/9/chartex" xmlns:cx4="http://schemas.microsoft.com/office/drawing/2016/5/10/chartex" xmlns:cx5="http://schemas.microsoft.com/office/drawing/2016/5/11/chartex" xmlns:cx6="http://schemas.microsoft.com/office/drawing/2016/5/12/chartex" xmlns:cx7="http://schemas.microsoft.com/office/drawing/2016/5/13/chartex" xmlns:cx8="http://schemas.microsoft.com/office/drawing/2016/5/14/chartex" xmlns:mc="http://schemas.openxmlformats.org/markup-compatibility/2006" xmlns:aink="http://schemas.microsoft.com/office/drawing/2016/ink" xmlns:am3d="http://schemas.microsoft.com/office/drawing/2017/model3d" xmlns:o="urn:schemas-microsoft-com:office:office" xmlns:oel="http://schemas.microsoft.com/office/2019/extlst" xmlns:r="http://schemas.openxmlformats.org/officeDocument/2006/relationships" xmlns:m="http://schemas.openxmlformats.org/officeDocument/2006/math" xmlns:v="urn:schemas-microsoft-com:vml" xmlns:wp14="http://schemas.microsoft.com/office/word/2010/wordprocessingDrawing" xmlns:wp="http://schemas.openxmlformats.org/drawingml/2006/wordprocessingDrawing" xmlns:w10="urn:schemas-microsoft-com:office:word" xmlns:w="http://schemas.openxmlformats.org/wordprocessingml/2006/main" xmlns:w14="http://schemas.microsoft.com/office/word/2010/wordml" xmlns:w15="http://schemas.microsoft.com/office/word/2012/wordml" xmlns:w16cex="http://schemas.microsoft.com/office/word/2018/wordml/cex" xmlns:w16cid="http://schemas.microsoft.com/office/word/2016/wordml/cid" xmlns:w16="http://schemas.microsoft.com/office/word/2018/wordml" xmlns:w16du="http://schemas.microsoft.com/office/word/2023/wordml/word16du" xmlns:w16sdtdh="http://schemas.microsoft.com/office/word/2020/wordml/sdtdatahash" xmlns:w16sdtfl="http://schemas.microsoft.com/office/word/2024/wordml/sdtformatlock" xmlns:w16se="http://schemas.microsoft.com/office/word/2015/wordml/symex" xmlns:wpg="http://schemas.microsoft.com/office/word/2010/wordprocessingGroup" xmlns:wpi="http://schemas.microsoft.com/office/word/2010/wordprocessingInk" xmlns:wne="http://schemas.microsoft.com/office/word/2006/wordml" xmlns:wps="http://schemas.microsoft.com/office/word/2010/wordprocessingShape" mc:Ignorable="w14 w15 w16se w16cid w16 w16cex w16sdtdh w16sdtfl w16du wp14">
   <w:p>
     <w:pPr>
       <w:pStyle w:val="Pieddepage"/>
@@ -1129,7 +1199,7 @@
         <w:sz w:val="18"/>
         <w:szCs w:val="18"/>
       </w:rPr>
-      <w:pict w14:anchorId="29A189A8">
+      <w:pict w14:anchorId="62E9DD61">
         <v:shapetype id="_x0000_t75" coordsize="21600,21600" o:spt="75" o:preferrelative="t" path="m@4@5l@4@11@9@11@9@5xe" filled="f" stroked="f">
           <v:stroke joinstyle="miter"/>
           <v:formulas>
@@ -1165,7 +1235,7 @@
 </file>
 
 <file path=word/footnotes.xml><?xml version="1.0" encoding="utf-8"?>
-<w:footnotes xmlns:wpc="http://schemas.microsoft.com/office/word/2010/wordprocessingCanvas" xmlns:cx="http://schemas.microsoft.com/office/drawing/2014/chartex" xmlns:cx1="http://schemas.microsoft.com/office/drawing/2015/9/8/chartex" xmlns:cx2="http://schemas.microsoft.com/office/drawing/2015/10/21/chartex" xmlns:cx3="http://schemas.microsoft.com/office/drawing/2016/5/9/chartex" xmlns:cx4="http://schemas.microsoft.com/office/drawing/2016/5/10/chartex" xmlns:cx5="http://schemas.microsoft.com/office/drawing/2016/5/11/chartex" xmlns:cx6="http://schemas.microsoft.com/office/drawing/2016/5/12/chartex" xmlns:cx7="http://schemas.microsoft.com/office/drawing/2016/5/13/chartex" xmlns:cx8="http://schemas.microsoft.com/office/drawing/2016/5/14/chartex" xmlns:mc="http://schemas.openxmlformats.org/markup-compatibility/2006" xmlns:aink="http://schemas.microsoft.com/office/drawing/2016/ink" xmlns:am3d="http://schemas.microsoft.com/office/drawing/2017/model3d" xmlns:o="urn:schemas-microsoft-com:office:office" xmlns:r="http://schemas.openxmlformats.org/officeDocument/2006/relationships" xmlns:m="http://schemas.openxmlformats.org/officeDocument/2006/math" xmlns:v="urn:schemas-microsoft-com:vml" xmlns:wp14="http://schemas.microsoft.com/office/word/2010/wordprocessingDrawing" xmlns:wp="http://schemas.openxmlformats.org/drawingml/2006/wordprocessingDrawing" xmlns:w10="urn:schemas-microsoft-com:office:word" xmlns:w="http://schemas.openxmlformats.org/wordprocessingml/2006/main" xmlns:w14="http://schemas.microsoft.com/office/word/2010/wordml" xmlns:w15="http://schemas.microsoft.com/office/word/2012/wordml" xmlns:w16cid="http://schemas.microsoft.com/office/word/2016/wordml/cid" xmlns:w16se="http://schemas.microsoft.com/office/word/2015/wordml/symex" xmlns:wpg="http://schemas.microsoft.com/office/word/2010/wordprocessingGroup" xmlns:wpi="http://schemas.microsoft.com/office/word/2010/wordprocessingInk" xmlns:wne="http://schemas.microsoft.com/office/word/2006/wordml" xmlns:wps="http://schemas.microsoft.com/office/word/2010/wordprocessingShape" mc:Ignorable="w14 w15 w16se w16cid wp14">
+<w:footnotes xmlns:wpc="http://schemas.microsoft.com/office/word/2010/wordprocessingCanvas" xmlns:cx="http://schemas.microsoft.com/office/drawing/2014/chartex" xmlns:cx1="http://schemas.microsoft.com/office/drawing/2015/9/8/chartex" xmlns:cx2="http://schemas.microsoft.com/office/drawing/2015/10/21/chartex" xmlns:cx3="http://schemas.microsoft.com/office/drawing/2016/5/9/chartex" xmlns:cx4="http://schemas.microsoft.com/office/drawing/2016/5/10/chartex" xmlns:cx5="http://schemas.microsoft.com/office/drawing/2016/5/11/chartex" xmlns:cx6="http://schemas.microsoft.com/office/drawing/2016/5/12/chartex" xmlns:cx7="http://schemas.microsoft.com/office/drawing/2016/5/13/chartex" xmlns:cx8="http://schemas.microsoft.com/office/drawing/2016/5/14/chartex" xmlns:mc="http://schemas.openxmlformats.org/markup-compatibility/2006" xmlns:aink="http://schemas.microsoft.com/office/drawing/2016/ink" xmlns:am3d="http://schemas.microsoft.com/office/drawing/2017/model3d" xmlns:o="urn:schemas-microsoft-com:office:office" xmlns:oel="http://schemas.microsoft.com/office/2019/extlst" xmlns:r="http://schemas.openxmlformats.org/officeDocument/2006/relationships" xmlns:m="http://schemas.openxmlformats.org/officeDocument/2006/math" xmlns:v="urn:schemas-microsoft-com:vml" xmlns:wp14="http://schemas.microsoft.com/office/word/2010/wordprocessingDrawing" xmlns:wp="http://schemas.openxmlformats.org/drawingml/2006/wordprocessingDrawing" xmlns:w10="urn:schemas-microsoft-com:office:word" xmlns:w="http://schemas.openxmlformats.org/wordprocessingml/2006/main" xmlns:w14="http://schemas.microsoft.com/office/word/2010/wordml" xmlns:w15="http://schemas.microsoft.com/office/word/2012/wordml" xmlns:w16cex="http://schemas.microsoft.com/office/word/2018/wordml/cex" xmlns:w16cid="http://schemas.microsoft.com/office/word/2016/wordml/cid" xmlns:w16="http://schemas.microsoft.com/office/word/2018/wordml" xmlns:w16du="http://schemas.microsoft.com/office/word/2023/wordml/word16du" xmlns:w16sdtdh="http://schemas.microsoft.com/office/word/2020/wordml/sdtdatahash" xmlns:w16sdtfl="http://schemas.microsoft.com/office/word/2024/wordml/sdtformatlock" xmlns:w16se="http://schemas.microsoft.com/office/word/2015/wordml/symex" xmlns:wpg="http://schemas.microsoft.com/office/word/2010/wordprocessingGroup" xmlns:wpi="http://schemas.microsoft.com/office/word/2010/wordprocessingInk" xmlns:wne="http://schemas.microsoft.com/office/word/2006/wordml" xmlns:wps="http://schemas.microsoft.com/office/word/2010/wordprocessingShape" mc:Ignorable="w14 w15 w16se w16cid w16 w16cex w16sdtdh w16sdtfl w16du wp14">
   <w:footnote w:type="separator" w:id="-1">
     <w:p>
       <w:r>
@@ -1184,7 +1254,7 @@
 </file>
 
 <file path=word/header1.xml><?xml version="1.0" encoding="utf-8"?>
-<w:hdr xmlns:wpc="http://schemas.microsoft.com/office/word/2010/wordprocessingCanvas" xmlns:cx="http://schemas.microsoft.com/office/drawing/2014/chartex" xmlns:cx1="http://schemas.microsoft.com/office/drawing/2015/9/8/chartex" xmlns:cx2="http://schemas.microsoft.com/office/drawing/2015/10/21/chartex" xmlns:cx3="http://schemas.microsoft.com/office/drawing/2016/5/9/chartex" xmlns:cx4="http://schemas.microsoft.com/office/drawing/2016/5/10/chartex" xmlns:cx5="http://schemas.microsoft.com/office/drawing/2016/5/11/chartex" xmlns:cx6="http://schemas.microsoft.com/office/drawing/2016/5/12/chartex" xmlns:cx7="http://schemas.microsoft.com/office/drawing/2016/5/13/chartex" xmlns:cx8="http://schemas.microsoft.com/office/drawing/2016/5/14/chartex" xmlns:mc="http://schemas.openxmlformats.org/markup-compatibility/2006" xmlns:aink="http://schemas.microsoft.com/office/drawing/2016/ink" xmlns:am3d="http://schemas.microsoft.com/office/drawing/2017/model3d" xmlns:o="urn:schemas-microsoft-com:office:office" xmlns:r="http://schemas.openxmlformats.org/officeDocument/2006/relationships" xmlns:m="http://schemas.openxmlformats.org/officeDocument/2006/math" xmlns:v="urn:schemas-microsoft-com:vml" xmlns:wp14="http://schemas.microsoft.com/office/word/2010/wordprocessingDrawing" xmlns:wp="http://schemas.openxmlformats.org/drawingml/2006/wordprocessingDrawing" xmlns:w10="urn:schemas-microsoft-com:office:word" xmlns:w="http://schemas.openxmlformats.org/wordprocessingml/2006/main" xmlns:w14="http://schemas.microsoft.com/office/word/2010/wordml" xmlns:w15="http://schemas.microsoft.com/office/word/2012/wordml" xmlns:w16cid="http://schemas.microsoft.com/office/word/2016/wordml/cid" xmlns:w16se="http://schemas.microsoft.com/office/word/2015/wordml/symex" xmlns:wpg="http://schemas.microsoft.com/office/word/2010/wordprocessingGroup" xmlns:wpi="http://schemas.microsoft.com/office/word/2010/wordprocessingInk" xmlns:wne="http://schemas.microsoft.com/office/word/2006/wordml" xmlns:wps="http://schemas.microsoft.com/office/word/2010/wordprocessingShape" mc:Ignorable="w14 w15 w16se w16cid wp14">
+<w:hdr xmlns:wpc="http://schemas.microsoft.com/office/word/2010/wordprocessingCanvas" xmlns:cx="http://schemas.microsoft.com/office/drawing/2014/chartex" xmlns:cx1="http://schemas.microsoft.com/office/drawing/2015/9/8/chartex" xmlns:cx2="http://schemas.microsoft.com/office/drawing/2015/10/21/chartex" xmlns:cx3="http://schemas.microsoft.com/office/drawing/2016/5/9/chartex" xmlns:cx4="http://schemas.microsoft.com/office/drawing/2016/5/10/chartex" xmlns:cx5="http://schemas.microsoft.com/office/drawing/2016/5/11/chartex" xmlns:cx6="http://schemas.microsoft.com/office/drawing/2016/5/12/chartex" xmlns:cx7="http://schemas.microsoft.com/office/drawing/2016/5/13/chartex" xmlns:cx8="http://schemas.microsoft.com/office/drawing/2016/5/14/chartex" xmlns:mc="http://schemas.openxmlformats.org/markup-compatibility/2006" xmlns:aink="http://schemas.microsoft.com/office/drawing/2016/ink" xmlns:am3d="http://schemas.microsoft.com/office/drawing/2017/model3d" xmlns:o="urn:schemas-microsoft-com:office:office" xmlns:oel="http://schemas.microsoft.com/office/2019/extlst" xmlns:r="http://schemas.openxmlformats.org/officeDocument/2006/relationships" xmlns:m="http://schemas.openxmlformats.org/officeDocument/2006/math" xmlns:v="urn:schemas-microsoft-com:vml" xmlns:wp14="http://schemas.microsoft.com/office/word/2010/wordprocessingDrawing" xmlns:wp="http://schemas.openxmlformats.org/drawingml/2006/wordprocessingDrawing" xmlns:w10="urn:schemas-microsoft-com:office:word" xmlns:w="http://schemas.openxmlformats.org/wordprocessingml/2006/main" xmlns:w14="http://schemas.microsoft.com/office/word/2010/wordml" xmlns:w15="http://schemas.microsoft.com/office/word/2012/wordml" xmlns:w16cex="http://schemas.microsoft.com/office/word/2018/wordml/cex" xmlns:w16cid="http://schemas.microsoft.com/office/word/2016/wordml/cid" xmlns:w16="http://schemas.microsoft.com/office/word/2018/wordml" xmlns:w16du="http://schemas.microsoft.com/office/word/2023/wordml/word16du" xmlns:w16sdtdh="http://schemas.microsoft.com/office/word/2020/wordml/sdtdatahash" xmlns:w16sdtfl="http://schemas.microsoft.com/office/word/2024/wordml/sdtformatlock" xmlns:w16se="http://schemas.microsoft.com/office/word/2015/wordml/symex" xmlns:wpg="http://schemas.microsoft.com/office/word/2010/wordprocessingGroup" xmlns:wpi="http://schemas.microsoft.com/office/word/2010/wordprocessingInk" xmlns:wne="http://schemas.microsoft.com/office/word/2006/wordml" xmlns:wps="http://schemas.microsoft.com/office/word/2010/wordprocessingShape" mc:Ignorable="w14 w15 w16se w16cid w16 w16cex w16sdtdh w16sdtfl w16du wp14">
   <w:p>
     <w:pPr>
       <w:pStyle w:val="En-tte"/>
@@ -1194,7 +1264,7 @@
         <w:noProof/>
       </w:rPr>
       <w:drawing>
-        <wp:anchor distT="0" distB="0" distL="114300" distR="114300" simplePos="0" relativeHeight="251657216" behindDoc="1" locked="0" layoutInCell="1" allowOverlap="1" wp14:anchorId="30527306" wp14:editId="66136F31">
+        <wp:anchor distT="0" distB="0" distL="114300" distR="114300" simplePos="0" relativeHeight="251657216" behindDoc="1" locked="0" layoutInCell="1" allowOverlap="1" wp14:anchorId="610BDE6E" wp14:editId="1F610757">
           <wp:simplePos x="0" y="0"/>
           <wp:positionH relativeFrom="page">
             <wp:posOffset>118745</wp:posOffset>
@@ -1261,7 +1331,7 @@
 </file>
 
 <file path=word/header2.xml><?xml version="1.0" encoding="utf-8"?>
-<w:hdr xmlns:wpc="http://schemas.microsoft.com/office/word/2010/wordprocessingCanvas" xmlns:cx="http://schemas.microsoft.com/office/drawing/2014/chartex" xmlns:cx1="http://schemas.microsoft.com/office/drawing/2015/9/8/chartex" xmlns:cx2="http://schemas.microsoft.com/office/drawing/2015/10/21/chartex" xmlns:cx3="http://schemas.microsoft.com/office/drawing/2016/5/9/chartex" xmlns:cx4="http://schemas.microsoft.com/office/drawing/2016/5/10/chartex" xmlns:cx5="http://schemas.microsoft.com/office/drawing/2016/5/11/chartex" xmlns:cx6="http://schemas.microsoft.com/office/drawing/2016/5/12/chartex" xmlns:cx7="http://schemas.microsoft.com/office/drawing/2016/5/13/chartex" xmlns:cx8="http://schemas.microsoft.com/office/drawing/2016/5/14/chartex" xmlns:mc="http://schemas.openxmlformats.org/markup-compatibility/2006" xmlns:aink="http://schemas.microsoft.com/office/drawing/2016/ink" xmlns:am3d="http://schemas.microsoft.com/office/drawing/2017/model3d" xmlns:o="urn:schemas-microsoft-com:office:office" xmlns:r="http://schemas.openxmlformats.org/officeDocument/2006/relationships" xmlns:m="http://schemas.openxmlformats.org/officeDocument/2006/math" xmlns:v="urn:schemas-microsoft-com:vml" xmlns:wp14="http://schemas.microsoft.com/office/word/2010/wordprocessingDrawing" xmlns:wp="http://schemas.openxmlformats.org/drawingml/2006/wordprocessingDrawing" xmlns:w10="urn:schemas-microsoft-com:office:word" xmlns:w="http://schemas.openxmlformats.org/wordprocessingml/2006/main" xmlns:w14="http://schemas.microsoft.com/office/word/2010/wordml" xmlns:w15="http://schemas.microsoft.com/office/word/2012/wordml" xmlns:w16cid="http://schemas.microsoft.com/office/word/2016/wordml/cid" xmlns:w16se="http://schemas.microsoft.com/office/word/2015/wordml/symex" xmlns:wpg="http://schemas.microsoft.com/office/word/2010/wordprocessingGroup" xmlns:wpi="http://schemas.microsoft.com/office/word/2010/wordprocessingInk" xmlns:wne="http://schemas.microsoft.com/office/word/2006/wordml" xmlns:wps="http://schemas.microsoft.com/office/word/2010/wordprocessingShape" mc:Ignorable="w14 w15 w16se w16cid wp14">
+<w:hdr xmlns:wpc="http://schemas.microsoft.com/office/word/2010/wordprocessingCanvas" xmlns:cx="http://schemas.microsoft.com/office/drawing/2014/chartex" xmlns:cx1="http://schemas.microsoft.com/office/drawing/2015/9/8/chartex" xmlns:cx2="http://schemas.microsoft.com/office/drawing/2015/10/21/chartex" xmlns:cx3="http://schemas.microsoft.com/office/drawing/2016/5/9/chartex" xmlns:cx4="http://schemas.microsoft.com/office/drawing/2016/5/10/chartex" xmlns:cx5="http://schemas.microsoft.com/office/drawing/2016/5/11/chartex" xmlns:cx6="http://schemas.microsoft.com/office/drawing/2016/5/12/chartex" xmlns:cx7="http://schemas.microsoft.com/office/drawing/2016/5/13/chartex" xmlns:cx8="http://schemas.microsoft.com/office/drawing/2016/5/14/chartex" xmlns:mc="http://schemas.openxmlformats.org/markup-compatibility/2006" xmlns:aink="http://schemas.microsoft.com/office/drawing/2016/ink" xmlns:am3d="http://schemas.microsoft.com/office/drawing/2017/model3d" xmlns:o="urn:schemas-microsoft-com:office:office" xmlns:oel="http://schemas.microsoft.com/office/2019/extlst" xmlns:r="http://schemas.openxmlformats.org/officeDocument/2006/relationships" xmlns:m="http://schemas.openxmlformats.org/officeDocument/2006/math" xmlns:v="urn:schemas-microsoft-com:vml" xmlns:wp14="http://schemas.microsoft.com/office/word/2010/wordprocessingDrawing" xmlns:wp="http://schemas.openxmlformats.org/drawingml/2006/wordprocessingDrawing" xmlns:w10="urn:schemas-microsoft-com:office:word" xmlns:w="http://schemas.openxmlformats.org/wordprocessingml/2006/main" xmlns:w14="http://schemas.microsoft.com/office/word/2010/wordml" xmlns:w15="http://schemas.microsoft.com/office/word/2012/wordml" xmlns:w16cex="http://schemas.microsoft.com/office/word/2018/wordml/cex" xmlns:w16cid="http://schemas.microsoft.com/office/word/2016/wordml/cid" xmlns:w16="http://schemas.microsoft.com/office/word/2018/wordml" xmlns:w16du="http://schemas.microsoft.com/office/word/2023/wordml/word16du" xmlns:w16sdtdh="http://schemas.microsoft.com/office/word/2020/wordml/sdtdatahash" xmlns:w16sdtfl="http://schemas.microsoft.com/office/word/2024/wordml/sdtformatlock" xmlns:w16se="http://schemas.microsoft.com/office/word/2015/wordml/symex" xmlns:wpg="http://schemas.microsoft.com/office/word/2010/wordprocessingGroup" xmlns:wpi="http://schemas.microsoft.com/office/word/2010/wordprocessingInk" xmlns:wne="http://schemas.microsoft.com/office/word/2006/wordml" xmlns:wps="http://schemas.microsoft.com/office/word/2010/wordprocessingShape" mc:Ignorable="w14 w15 w16se w16cid w16 w16cex w16sdtdh w16sdtfl w16du wp14">
   <w:p>
     <w:pPr>
       <w:pStyle w:val="En-tte"/>
@@ -1271,7 +1341,7 @@
         <w:noProof/>
       </w:rPr>
       <w:drawing>
-        <wp:anchor distT="0" distB="0" distL="114300" distR="114300" simplePos="0" relativeHeight="251656192" behindDoc="1" locked="0" layoutInCell="1" allowOverlap="1" wp14:anchorId="44CCAC21" wp14:editId="7AF44833">
+        <wp:anchor distT="0" distB="0" distL="114300" distR="114300" simplePos="0" relativeHeight="251656192" behindDoc="1" locked="0" layoutInCell="1" allowOverlap="1" wp14:anchorId="59A98DD4" wp14:editId="58B2EAE3">
           <wp:simplePos x="0" y="0"/>
           <wp:positionH relativeFrom="margin">
             <wp:align>center</wp:align>
@@ -1338,7 +1408,7 @@
 </file>
 
 <file path=word/numbering.xml><?xml version="1.0" encoding="utf-8"?>
-<w:numbering xmlns:wpc="http://schemas.microsoft.com/office/word/2010/wordprocessingCanvas" xmlns:cx="http://schemas.microsoft.com/office/drawing/2014/chartex" xmlns:cx1="http://schemas.microsoft.com/office/drawing/2015/9/8/chartex" xmlns:cx2="http://schemas.microsoft.com/office/drawing/2015/10/21/chartex" xmlns:cx3="http://schemas.microsoft.com/office/drawing/2016/5/9/chartex" xmlns:cx4="http://schemas.microsoft.com/office/drawing/2016/5/10/chartex" xmlns:cx5="http://schemas.microsoft.com/office/drawing/2016/5/11/chartex" xmlns:cx6="http://schemas.microsoft.com/office/drawing/2016/5/12/chartex" xmlns:cx7="http://schemas.microsoft.com/office/drawing/2016/5/13/chartex" xmlns:cx8="http://schemas.microsoft.com/office/drawing/2016/5/14/chartex" xmlns:mc="http://schemas.openxmlformats.org/markup-compatibility/2006" xmlns:aink="http://schemas.microsoft.com/office/drawing/2016/ink" xmlns:am3d="http://schemas.microsoft.com/office/drawing/2017/model3d" xmlns:o="urn:schemas-microsoft-com:office:office" xmlns:r="http://schemas.openxmlformats.org/officeDocument/2006/relationships" xmlns:m="http://schemas.openxmlformats.org/officeDocument/2006/math" xmlns:v="urn:schemas-microsoft-com:vml" xmlns:wp14="http://schemas.microsoft.com/office/word/2010/wordprocessingDrawing" xmlns:wp="http://schemas.openxmlformats.org/drawingml/2006/wordprocessingDrawing" xmlns:w10="urn:schemas-microsoft-com:office:word" xmlns:w="http://schemas.openxmlformats.org/wordprocessingml/2006/main" xmlns:w14="http://schemas.microsoft.com/office/word/2010/wordml" xmlns:w15="http://schemas.microsoft.com/office/word/2012/wordml" xmlns:w16cid="http://schemas.microsoft.com/office/word/2016/wordml/cid" xmlns:w16se="http://schemas.microsoft.com/office/word/2015/wordml/symex" xmlns:wpg="http://schemas.microsoft.com/office/word/2010/wordprocessingGroup" xmlns:wpi="http://schemas.microsoft.com/office/word/2010/wordprocessingInk" xmlns:wne="http://schemas.microsoft.com/office/word/2006/wordml" xmlns:wps="http://schemas.microsoft.com/office/word/2010/wordprocessingShape" mc:Ignorable="w14 w15 w16se w16cid wp14">
+<w:numbering xmlns:wpc="http://schemas.microsoft.com/office/word/2010/wordprocessingCanvas" xmlns:cx="http://schemas.microsoft.com/office/drawing/2014/chartex" xmlns:cx1="http://schemas.microsoft.com/office/drawing/2015/9/8/chartex" xmlns:cx2="http://schemas.microsoft.com/office/drawing/2015/10/21/chartex" xmlns:cx3="http://schemas.microsoft.com/office/drawing/2016/5/9/chartex" xmlns:cx4="http://schemas.microsoft.com/office/drawing/2016/5/10/chartex" xmlns:cx5="http://schemas.microsoft.com/office/drawing/2016/5/11/chartex" xmlns:cx6="http://schemas.microsoft.com/office/drawing/2016/5/12/chartex" xmlns:cx7="http://schemas.microsoft.com/office/drawing/2016/5/13/chartex" xmlns:cx8="http://schemas.microsoft.com/office/drawing/2016/5/14/chartex" xmlns:mc="http://schemas.openxmlformats.org/markup-compatibility/2006" xmlns:aink="http://schemas.microsoft.com/office/drawing/2016/ink" xmlns:am3d="http://schemas.microsoft.com/office/drawing/2017/model3d" xmlns:o="urn:schemas-microsoft-com:office:office" xmlns:oel="http://schemas.microsoft.com/office/2019/extlst" xmlns:r="http://schemas.openxmlformats.org/officeDocument/2006/relationships" xmlns:m="http://schemas.openxmlformats.org/officeDocument/2006/math" xmlns:v="urn:schemas-microsoft-com:vml" xmlns:wp14="http://schemas.microsoft.com/office/word/2010/wordprocessingDrawing" xmlns:wp="http://schemas.openxmlformats.org/drawingml/2006/wordprocessingDrawing" xmlns:w10="urn:schemas-microsoft-com:office:word" xmlns:w="http://schemas.openxmlformats.org/wordprocessingml/2006/main" xmlns:w14="http://schemas.microsoft.com/office/word/2010/wordml" xmlns:w15="http://schemas.microsoft.com/office/word/2012/wordml" xmlns:w16cex="http://schemas.microsoft.com/office/word/2018/wordml/cex" xmlns:w16cid="http://schemas.microsoft.com/office/word/2016/wordml/cid" xmlns:w16="http://schemas.microsoft.com/office/word/2018/wordml" xmlns:w16du="http://schemas.microsoft.com/office/word/2023/wordml/word16du" xmlns:w16sdtdh="http://schemas.microsoft.com/office/word/2020/wordml/sdtdatahash" xmlns:w16sdtfl="http://schemas.microsoft.com/office/word/2024/wordml/sdtformatlock" xmlns:w16se="http://schemas.microsoft.com/office/word/2015/wordml/symex" xmlns:wpg="http://schemas.microsoft.com/office/word/2010/wordprocessingGroup" xmlns:wpi="http://schemas.microsoft.com/office/word/2010/wordprocessingInk" xmlns:wne="http://schemas.microsoft.com/office/word/2006/wordml" xmlns:wps="http://schemas.microsoft.com/office/word/2010/wordprocessingShape" mc:Ignorable="w14 w15 w16se w16cid w16 w16cex w16sdtdh w16sdtfl w16du wp14">
   <w:abstractNum w:abstractNumId="0" w15:restartNumberingAfterBreak="0">
     <w:nsid w:val="0000A990"/>
     <w:multiLevelType w:val="multilevel"/>
@@ -1973,34 +2043,34 @@
       </w:pPr>
     </w:lvl>
   </w:abstractNum>
-  <w:num w:numId="1">
+  <w:num w:numId="1" w16cid:durableId="578368190">
     <w:abstractNumId w:val="0"/>
   </w:num>
-  <w:num w:numId="2">
+  <w:num w:numId="2" w16cid:durableId="1580824215">
     <w:abstractNumId w:val="1"/>
   </w:num>
-  <w:num w:numId="3">
+  <w:num w:numId="3" w16cid:durableId="2065719044">
     <w:abstractNumId w:val="1"/>
   </w:num>
-  <w:num w:numId="4">
+  <w:num w:numId="4" w16cid:durableId="1975332066">
     <w:abstractNumId w:val="3"/>
   </w:num>
-  <w:num w:numId="5">
+  <w:num w:numId="5" w16cid:durableId="54938964">
     <w:abstractNumId w:val="5"/>
   </w:num>
-  <w:num w:numId="6">
+  <w:num w:numId="6" w16cid:durableId="1337534771">
     <w:abstractNumId w:val="6"/>
   </w:num>
-  <w:num w:numId="7">
+  <w:num w:numId="7" w16cid:durableId="2031104195">
     <w:abstractNumId w:val="4"/>
   </w:num>
-  <w:num w:numId="8">
+  <w:num w:numId="8" w16cid:durableId="953829392">
     <w:abstractNumId w:val="0"/>
   </w:num>
-  <w:num w:numId="9">
+  <w:num w:numId="9" w16cid:durableId="1582905176">
     <w:abstractNumId w:val="2"/>
   </w:num>
-  <w:num w:numId="10">
+  <w:num w:numId="10" w16cid:durableId="2140872918">
     <w:abstractNumId w:val="4"/>
     <w:lvlOverride w:ilvl="0">
       <w:startOverride w:val="1"/>
@@ -2010,7 +2080,7 @@
 </file>
 
 <file path=word/styles.xml><?xml version="1.0" encoding="utf-8"?>
-<w:styles xmlns:mc="http://schemas.openxmlformats.org/markup-compatibility/2006" xmlns:r="http://schemas.openxmlformats.org/officeDocument/2006/relationships" xmlns:w="http://schemas.openxmlformats.org/wordprocessingml/2006/main" xmlns:w14="http://schemas.microsoft.com/office/word/2010/wordml" xmlns:w15="http://schemas.microsoft.com/office/word/2012/wordml" xmlns:w16cid="http://schemas.microsoft.com/office/word/2016/wordml/cid" xmlns:w16se="http://schemas.microsoft.com/office/word/2015/wordml/symex" mc:Ignorable="w14 w15 w16se w16cid">
+<w:styles xmlns:mc="http://schemas.openxmlformats.org/markup-compatibility/2006" xmlns:r="http://schemas.openxmlformats.org/officeDocument/2006/relationships" xmlns:w="http://schemas.openxmlformats.org/wordprocessingml/2006/main" xmlns:w14="http://schemas.microsoft.com/office/word/2010/wordml" xmlns:w15="http://schemas.microsoft.com/office/word/2012/wordml" xmlns:w16cex="http://schemas.microsoft.com/office/word/2018/wordml/cex" xmlns:w16cid="http://schemas.microsoft.com/office/word/2016/wordml/cid" xmlns:w16="http://schemas.microsoft.com/office/word/2018/wordml" xmlns:w16du="http://schemas.microsoft.com/office/word/2023/wordml/word16du" xmlns:w16sdtdh="http://schemas.microsoft.com/office/word/2020/wordml/sdtdatahash" xmlns:w16sdtfl="http://schemas.microsoft.com/office/word/2024/wordml/sdtformatlock" xmlns:w16se="http://schemas.microsoft.com/office/word/2015/wordml/symex" mc:Ignorable="w14 w15 w16se w16cid w16 w16cex w16sdtdh w16sdtfl w16du">
   <w:docDefaults>
     <w:rPrDefault>
       <w:rPr>
@@ -2026,7 +2096,7 @@
       </w:pPr>
     </w:pPrDefault>
   </w:docDefaults>
-  <w:latentStyles w:defLockedState="0" w:defUIPriority="0" w:defSemiHidden="0" w:defUnhideWhenUsed="0" w:defQFormat="0" w:count="375">
+  <w:latentStyles w:defLockedState="0" w:defUIPriority="0" w:defSemiHidden="0" w:defUnhideWhenUsed="0" w:defQFormat="0" w:count="376">
     <w:lsdException w:name="heading 6" w:semiHidden="1" w:unhideWhenUsed="1"/>
     <w:lsdException w:name="index 3" w:semiHidden="1" w:unhideWhenUsed="1"/>
     <w:lsdException w:name="index 4" w:semiHidden="1" w:unhideWhenUsed="1"/>
@@ -2361,6 +2431,7 @@
     <w:lsdException w:name="Smart Hyperlink" w:semiHidden="1" w:uiPriority="99" w:unhideWhenUsed="1"/>
     <w:lsdException w:name="Hashtag" w:semiHidden="1" w:uiPriority="99" w:unhideWhenUsed="1"/>
     <w:lsdException w:name="Unresolved Mention" w:semiHidden="1" w:uiPriority="99" w:unhideWhenUsed="1"/>
+    <w:lsdException w:name="Smart Link" w:semiHidden="1" w:uiPriority="99" w:unhideWhenUsed="1"/>
   </w:latentStyles>
   <w:style w:type="paragraph" w:default="1" w:styleId="Normal">
     <w:name w:val="Normal"/>
@@ -3447,6 +3518,24 @@
       <w:spacing w:after="100"/>
       <w:ind w:left="220"/>
     </w:pPr>
+  </w:style>
+  <w:style w:type="table" w:styleId="Grilledutableau">
+    <w:name w:val="Table Grid"/>
+    <w:basedOn w:val="TableauNormal"/>
+    <w:rsid w:val="00C312F8"/>
+    <w:pPr>
+      <w:spacing w:after="0"/>
+    </w:pPr>
+    <w:tblPr>
+      <w:tblBorders>
+        <w:top w:val="single" w:sz="4" w:space="0" w:color="auto"/>
+        <w:left w:val="single" w:sz="4" w:space="0" w:color="auto"/>
+        <w:bottom w:val="single" w:sz="4" w:space="0" w:color="auto"/>
+        <w:right w:val="single" w:sz="4" w:space="0" w:color="auto"/>
+        <w:insideH w:val="single" w:sz="4" w:space="0" w:color="auto"/>
+        <w:insideV w:val="single" w:sz="4" w:space="0" w:color="auto"/>
+      </w:tblBorders>
+    </w:tblPr>
   </w:style>
 </w:styles>
 </file>

</xml_diff>